<commit_message>
docs: integrantes reales del equipo y guiones reasignados a 4 expositores
Equipo definitivo (4 integrantes, dentro del maximo del rubro):
Mamani Mendoza Joseph Elvis, Lipe Machaca Juan Artemio,
Ticona Erquinigo Jhoel Yovani, Tapara Ccahuana Paul Renmis.

- Ambos informes (md + docx) llevan los nombres correctos; el de Computacion
  Paralela tenia una lista de integrantes desactualizada.
- Guiones redistribuidos de 5 a 4 secciones: Joseph abre y cierra, Juan expone
  el modelo, Jhoel hace la demo en ingles y Paul cubre despliegue + IC/pruebas.
- README de coordinacion actualizado: total 12:00 exactos.

Co-Authored-By: Claude Opus 4.8 <noreply@anthropic.com>
</commit_message>
<xml_diff>
--- a/docs/informe_computacion_paralela_distribuida.docx
+++ b/docs/informe_computacion_paralela_distribuida.docx
@@ -50,30 +50,6 @@
         <w:pStyle w:val="ListBullet"/>
       </w:pPr>
       <w:r>
-        <w:t>Apaza Llanos, Yoel</w:t>
-      </w:r>
-    </w:p>
-    <w:p>
-      <w:pPr>
-        <w:pStyle w:val="ListBullet"/>
-      </w:pPr>
-      <w:r>
-        <w:t>Pari Pari, Yimmy Ronaldo</w:t>
-      </w:r>
-    </w:p>
-    <w:p>
-      <w:pPr>
-        <w:pStyle w:val="ListBullet"/>
-      </w:pPr>
-      <w:r>
-        <w:t>Flores Curasi, Héctor Luis</w:t>
-      </w:r>
-    </w:p>
-    <w:p>
-      <w:pPr>
-        <w:pStyle w:val="ListBullet"/>
-      </w:pPr>
-      <w:r>
         <w:t>Mamani Mendoza, Joseph Elvis</w:t>
       </w:r>
     </w:p>
@@ -82,7 +58,23 @@
         <w:pStyle w:val="ListBullet"/>
       </w:pPr>
       <w:r>
-        <w:t>Quispe Galindo, Jahan Kevin</w:t>
+        <w:t>Lipe Machaca, Juan Artemio</w:t>
+      </w:r>
+    </w:p>
+    <w:p>
+      <w:pPr>
+        <w:pStyle w:val="ListBullet"/>
+      </w:pPr>
+      <w:r>
+        <w:t>Ticona Erquinigo, Jhoel Yovani</w:t>
+      </w:r>
+    </w:p>
+    <w:p>
+      <w:pPr>
+        <w:pStyle w:val="ListBullet"/>
+      </w:pPr>
+      <w:r>
+        <w:t>Tapara Ccahuana, Paul Renmis</w:t>
       </w:r>
     </w:p>
     <w:p>

</xml_diff>